<commit_message>
Roteiro Elvis: revisão da parte 3
Co-Authored-By: Claude Opus 5.5 <noreply@anthropic.com>
Claude-Session: https://claude.ai/code/session_01MJjUEEZrxQDEUifKK2vj9g
</commit_message>
<xml_diff>
--- a/roteiros/elvis/Elvis_Parte3.docx
+++ b/roteiros/elvis/Elvis_Parte3.docx
@@ -63,15 +63,7 @@
         <w:rPr>
           <w:color w:val="000000"/>
         </w:rPr>
-        <w:t>Para o Coronel, era a máquina perfeita.</w:t>
-      </w:r>
-    </w:p>
-    <w:p>
-      <w:r>
-        <w:rPr>
-          <w:color w:val="000000"/>
-        </w:rPr>
-        <w:t>Para Elvis, virou uma prisão.</w:t>
+        <w:t>Para o Coronel, era a máquina perfeita. E Elvis, aos poucos, começou a se sentir preso dentro dela.</w:t>
       </w:r>
     </w:p>
     <w:p>
@@ -87,7 +79,7 @@
         <w:rPr>
           <w:color w:val="000000"/>
         </w:rPr>
-        <w:t>Segundo relatos de quem trabalhou com ele, propostas para filmes mais ambiciosos chegaram a aparecer. Mas o Coronel queria cachê alto, controle total e trilha sonora garantida. E os papéis sérios foram ficando pelo caminho.</w:t>
+        <w:t>Segundo relatos de quem trabalhou com ele, propostas para filmes mais ambiciosos chegaram a aparecer. Mas o Coronel queria cachê alto e trilha sonora garantida. E os papéis sérios foram ficando pelo caminho.</w:t>
       </w:r>
     </w:p>
     <w:p>
@@ -143,7 +135,7 @@
         <w:rPr>
           <w:color w:val="000000"/>
         </w:rPr>
-        <w:t>Nenhum grande empresário de artistas cobrava isso. O padrão da indústria girava em torno de dez a vinte e cinco por cento.</w:t>
+        <w:t>Pouquíssimos empresários de artistas cobravam algo parecido. O padrão da indústria girava em torno de dez a vinte e cinco por cento.</w:t>
       </w:r>
     </w:p>
     <w:p>
@@ -223,7 +215,7 @@
         <w:rPr>
           <w:color w:val="C00000"/>
         </w:rPr>
-        <w:t>Pare um segundo nessa cena. O homem mais famoso do planeta se casando numa sala de hotel, cercado de fotógrafos, com os melhores amigos do lado de fora da porta. E o homem que decidiu tudo isso nem era da família.</w:t>
+        <w:t>Pare um segundo nessa cena. O Rei do Rock se casando numa sala de hotel, cercado de fotógrafos, com os melhores amigos do lado de fora da porta. E o homem que decidiu tudo isso nem era da família.</w:t>
       </w:r>
     </w:p>
     <w:p>
@@ -367,7 +359,7 @@
         <w:rPr>
           <w:color w:val="000000"/>
         </w:rPr>
-        <w:t>E enquanto Elvis cantava no palco, o Coronel passava horas no cassino do mesmo hotel.</w:t>
+        <w:t>E enquanto Elvis cantava no palco, o Coronel passava horas na mesa de roleta do cassino, no mesmo hotel. Guarde essa imagem, porque ela vai voltar com números que você não vai esquecer.</w:t>
       </w:r>
     </w:p>
     <w:p>
@@ -439,15 +431,7 @@
         <w:rPr>
           <w:color w:val="C00000"/>
         </w:rPr>
-        <w:t>Guarde esse contraste. Porque o terceiro personagem mais importante dessa história ainda nem apareceu. Um médico de Memphis que entraria na vida de Elvis com uma caneta e um bloco de receitas. E o Coronel, que controlava cada contrato, segundo quem conviveu com os dois, não fez nada para impedir.</w:t>
-      </w:r>
-    </w:p>
-    <w:p>
-      <w:r>
-        <w:rPr>
-          <w:color w:val="000000"/>
-        </w:rPr>
-        <w:t>Guarde também outra imagem. O Coronel na mesa de roleta, no andar de baixo, enquanto o Rei cantava lá em cima. Porque ela vai voltar, e vai voltar com números que você não vai esquecer.</w:t>
+        <w:t>Repare nesse contraste. Porque o terceiro personagem mais importante dessa história ainda nem apareceu. Um médico de Memphis que entraria na vida de Elvis com uma caneta e um bloco de receitas. E o Coronel, que controlava cada contrato, segundo quem conviveu com os dois, não fez nada para impedir.</w:t>
       </w:r>
     </w:p>
     <w:p>
@@ -455,7 +439,7 @@
         <w:rPr>
           <w:color w:val="C00000"/>
         </w:rPr>
-        <w:t>E agora você vai entender, finalmente, o que estava por trás de tudo isso. Por que o Coronel nunca foi à Alemanha. Por que recusava todas as propostas do exterior. Por que o maior astro do planeta nunca fez um único show na Europa.</w:t>
+        <w:t>E agora você vai entender, finalmente, o que estava por trás de tudo isso. Por que o Coronel nunca foi à Alemanha e recusava todas as propostas do exterior. E por que o maior astro do planeta nunca fez um único show na Europa.</w:t>
       </w:r>
     </w:p>
     <w:p>

</xml_diff>